<commit_message>
docs: laporan uji nyata diperbarui - 4 order ber-foto pulih (deep scan blok) + perbaikan detector
</commit_message>
<xml_diff>
--- a/docs/laporan-uji-nyata-2026-09-21.docx
+++ b/docs/laporan-uji-nyata-2026-09-21.docx
@@ -15,7 +15,7 @@
         <w:jc w:val="center"/>
       </w:pPr>
       <w:r>
-        <w:t>Tanggal uji: 21 September 2026 · Wallet uji: 0xAb7148C867be4Abf05c6bD0C849a840B5d8E8d9F (EVM) / 52zeWYfC2tc6SkPDtUYNM5G8oHR8yN6HHAPYCv3a6rMU (Solana)</w:t>
+        <w:t>Tanggal uji: 21 September 2026 (diperbarui 21 Sep 2026 malam) · Wallet uji: 0xAb7148C867be4Abf05c6bD0C849a840B5d8E8d9F (EVM) / 52zeWYfC2tc6SkPDtUYNM5G8oHR8yN6HHAPYCv3a6rMU (Solana)</w:t>
       </w:r>
     </w:p>
     <w:p>
@@ -1678,7 +1678,7 @@
     <w:p/>
     <w:p>
       <w:r>
-        <w:t>Semua payout diverifikasi ulang lewat RPC: receipt status 1 dan saldo wallet uji bertambah.</w:t>
+        <w:t>Semua payout diverifikasi ulang lewat RPC: receipt status 1 dan saldo wallet uji bertambah. Empat order lama yang buktinya hanya foto (tanpa TX hash) dipulihkan lewat deep scan blok (eth_getBlockReceipts untuk BSC, blok penuh untuk KAIA) di jendela waktu sekitar pembuatan order.</w:t>
       </w:r>
     </w:p>
     <w:p>
@@ -1961,6 +1961,174 @@
           <w:p>
             <w:r>
               <w:t>Deposit terverifikasi</w:t>
+            </w:r>
+          </w:p>
+        </w:tc>
+      </w:tr>
+      <w:tr>
+        <w:tc>
+          <w:tcPr>
+            <w:tcW w:type="dxa" w:w="2160"/>
+          </w:tcPr>
+          <w:p>
+            <w:r>
+              <w:t>SWAP-20260920165623-312</w:t>
+            </w:r>
+          </w:p>
+        </w:tc>
+        <w:tc>
+          <w:tcPr>
+            <w:tcW w:type="dxa" w:w="2160"/>
+          </w:tcPr>
+          <w:p>
+            <w:r>
+              <w:t>Convert</w:t>
+            </w:r>
+          </w:p>
+        </w:tc>
+        <w:tc>
+          <w:tcPr>
+            <w:tcW w:type="dxa" w:w="2160"/>
+          </w:tcPr>
+          <w:p>
+            <w:r>
+              <w:t>0,4 USDT BSC -&gt; USDC POLYGON</w:t>
+            </w:r>
+          </w:p>
+        </w:tc>
+        <w:tc>
+          <w:tcPr>
+            <w:tcW w:type="dxa" w:w="2160"/>
+          </w:tcPr>
+          <w:p>
+            <w:r>
+              <w:t>COMPLETED (payout 0xb87ff921...)</w:t>
+            </w:r>
+          </w:p>
+        </w:tc>
+      </w:tr>
+      <w:tr>
+        <w:tc>
+          <w:tcPr>
+            <w:tcW w:type="dxa" w:w="2160"/>
+          </w:tcPr>
+          <w:p>
+            <w:r>
+              <w:t>SWAP-20260920124945-312</w:t>
+            </w:r>
+          </w:p>
+        </w:tc>
+        <w:tc>
+          <w:tcPr>
+            <w:tcW w:type="dxa" w:w="2160"/>
+          </w:tcPr>
+          <w:p>
+            <w:r>
+              <w:t>Convert</w:t>
+            </w:r>
+          </w:p>
+        </w:tc>
+        <w:tc>
+          <w:tcPr>
+            <w:tcW w:type="dxa" w:w="2160"/>
+          </w:tcPr>
+          <w:p>
+            <w:r>
+              <w:t>1 USDT BSC -&gt; USDC ETH</w:t>
+            </w:r>
+          </w:p>
+        </w:tc>
+        <w:tc>
+          <w:tcPr>
+            <w:tcW w:type="dxa" w:w="2160"/>
+          </w:tcPr>
+          <w:p>
+            <w:r>
+              <w:t>COMPLETED (payout 0xd72c8e36...)</w:t>
+            </w:r>
+          </w:p>
+        </w:tc>
+      </w:tr>
+      <w:tr>
+        <w:tc>
+          <w:tcPr>
+            <w:tcW w:type="dxa" w:w="2160"/>
+          </w:tcPr>
+          <w:p>
+            <w:r>
+              <w:t>ORD-20260920-SPX</w:t>
+            </w:r>
+          </w:p>
+        </w:tc>
+        <w:tc>
+          <w:tcPr>
+            <w:tcW w:type="dxa" w:w="2160"/>
+          </w:tcPr>
+          <w:p>
+            <w:r>
+              <w:t>Sell</w:t>
+            </w:r>
+          </w:p>
+        </w:tc>
+        <w:tc>
+          <w:tcPr>
+            <w:tcW w:type="dxa" w:w="2160"/>
+          </w:tcPr>
+          <w:p>
+            <w:r>
+              <w:t>0,5 USDT (BSC)</w:t>
+            </w:r>
+          </w:p>
+        </w:tc>
+        <w:tc>
+          <w:tcPr>
+            <w:tcW w:type="dxa" w:w="2160"/>
+          </w:tcPr>
+          <w:p>
+            <w:r>
+              <w:t>Deposit terverifikasi (antrean bayar IDR)</w:t>
+            </w:r>
+          </w:p>
+        </w:tc>
+      </w:tr>
+      <w:tr>
+        <w:tc>
+          <w:tcPr>
+            <w:tcW w:type="dxa" w:w="2160"/>
+          </w:tcPr>
+          <w:p>
+            <w:r>
+              <w:t>ORD-20260920-FJ1</w:t>
+            </w:r>
+          </w:p>
+        </w:tc>
+        <w:tc>
+          <w:tcPr>
+            <w:tcW w:type="dxa" w:w="2160"/>
+          </w:tcPr>
+          <w:p>
+            <w:r>
+              <w:t>Sell</w:t>
+            </w:r>
+          </w:p>
+        </w:tc>
+        <w:tc>
+          <w:tcPr>
+            <w:tcW w:type="dxa" w:w="2160"/>
+          </w:tcPr>
+          <w:p>
+            <w:r>
+              <w:t>30 KAIA (KAIA)</w:t>
+            </w:r>
+          </w:p>
+        </w:tc>
+        <w:tc>
+          <w:tcPr>
+            <w:tcW w:type="dxa" w:w="2160"/>
+          </w:tcPr>
+          <w:p>
+            <w:r>
+              <w:t>Deposit terverifikasi (antrean bayar IDR)</w:t>
             </w:r>
           </w:p>
         </w:tc>
@@ -2340,7 +2508,15 @@
         <w:pStyle w:val="ListBullet"/>
       </w:pPr>
       <w:r>
-        <w:t>Order swap yang 'expired' bisa dipulihkan bila deposit sah dalam 24 jam (sebelumnya hanya sell).</w:t>
+        <w:t>Order swap yang 'expired' bisa dipulihkan bila deposit sah (query detektor kini sell+swap, jendela 48 jam).</w:t>
+      </w:r>
+    </w:p>
+    <w:p>
+      <w:pPr>
+        <w:pStyle w:val="ListBullet"/>
+      </w:pPr>
+      <w:r>
+        <w:t>Auto-scan/verifikasi memakai cache RPC yang berhasil, sehingga tidak lagi menghajar RPC BSC yang menolak getLogs.</w:t>
       </w:r>
     </w:p>
     <w:p>

</xml_diff>

<commit_message>
style(pesan): hapus em dash di teks yang dilihat user (R-02 antislop)
Delapan baris pesan Telegram (laporan keuangan, daftar admin, status order, petunjuk
token, sambutan, info swap) memakai em dash. Diganti koma/titik dua/tanda kurung.
Komentar dan docstring developer tidak disentuh.
</commit_message>
<xml_diff>
--- a/docs/laporan-uji-nyata-2026-09-21.docx
+++ b/docs/laporan-uji-nyata-2026-09-21.docx
@@ -68,7 +68,7 @@
         <w:pStyle w:val="ListBullet"/>
       </w:pPr>
       <w:r>
-        <w:t>Aset baru: USDG di jaringan Robinhood (menggantikan GRAVITY) — kirim uji 1 USDG berhasil.</w:t>
+        <w:t>Aset baru: USDG di jaringan Robinhood (menggantikan GRAVITY) , kirim uji 1 USDG berhasil.</w:t>
       </w:r>
     </w:p>
     <w:p>
@@ -1427,7 +1427,7 @@
     </w:p>
     <w:p>
       <w:r>
-        <w:t>Catatan penting: ETH L1 (ETH/USDT/USDC) sengaja masuk MANUAL REVIEW bila estimasi gas melebihi batas Rp 250.000 — ini pengaman biaya, bukan kerusakan.</w:t>
+        <w:t>Catatan penting: ETH L1 (ETH/USDT/USDC) sengaja masuk MANUAL REVIEW bila estimasi gas melebihi batas Rp 250.000 , ini pengaman biaya, bukan kerusakan.</w:t>
       </w:r>
     </w:p>
     <w:p>
@@ -2738,7 +2738,7 @@
           </w:tcPr>
           <w:p>
             <w:r>
-              <w:t>Free tier tidak mencakup BSC — deposit lama BSC wajib pakai TX hash</w:t>
+              <w:t>Free tier tidak mencakup BSC , deposit lama BSC wajib pakai TX hash</w:t>
             </w:r>
           </w:p>
         </w:tc>

</xml_diff>

<commit_message>
docs: laporan uji nyata - seksi pemeliharaan 25 Sep (jendela getLogs, order macet)
</commit_message>
<xml_diff>
--- a/docs/laporan-uji-nyata-2026-09-21.docx
+++ b/docs/laporan-uji-nyata-2026-09-21.docx
@@ -2760,6 +2760,130 @@
     </w:p>
     <w:p/>
     <w:p>
+      <w:pPr>
+        <w:pStyle w:val="Heading1"/>
+      </w:pPr>
+      <w:r>
+        <w:t>8. Pemeliharaan 25 Sep 2026</w:t>
+      </w:r>
+    </w:p>
+    <w:p>
+      <w:r>
+        <w:t>Tiga perbaikan pemeliharaan diterapkan ke produksi setelah uji nyata (commit 9447fa6, deploy 0c564575):</w:t>
+      </w:r>
+    </w:p>
+    <w:tbl>
+      <w:tblPr>
+        <w:tblStyle w:val="LightGrid-Accent1"/>
+        <w:tblW w:type="auto" w:w="0"/>
+        <w:tblLook w:firstColumn="1" w:firstRow="1" w:lastColumn="0" w:lastRow="0" w:noHBand="0" w:noVBand="1" w:val="04A0"/>
+      </w:tblPr>
+      <w:tblGrid>
+        <w:gridCol w:w="4320"/>
+        <w:gridCol w:w="4320"/>
+      </w:tblGrid>
+      <w:tr>
+        <w:tc>
+          <w:tcPr>
+            <w:tcW w:type="dxa" w:w="4320"/>
+          </w:tcPr>
+          <w:p>
+            <w:r>
+              <w:rPr>
+                <w:b/>
+              </w:rPr>
+              <w:t>Perbaikan</w:t>
+            </w:r>
+          </w:p>
+        </w:tc>
+        <w:tc>
+          <w:tcPr>
+            <w:tcW w:type="dxa" w:w="4320"/>
+          </w:tcPr>
+          <w:p>
+            <w:r>
+              <w:rPr>
+                <w:b/>
+              </w:rPr>
+              <w:t>Dampak</w:t>
+            </w:r>
+          </w:p>
+        </w:tc>
+      </w:tr>
+      <w:tr>
+        <w:tc>
+          <w:tcPr>
+            <w:tcW w:type="dxa" w:w="4320"/>
+          </w:tcPr>
+          <w:p>
+            <w:r>
+              <w:t>Jendela pindaian eth_getLogs 2000 blok menjadi 25 blok</w:t>
+            </w:r>
+          </w:p>
+        </w:tc>
+        <w:tc>
+          <w:tcPr>
+            <w:tcW w:type="dxa" w:w="4320"/>
+          </w:tcPr>
+          <w:p>
+            <w:r>
+              <w:t>Pindaian deposit BSC diterima RPC publik; spam error tiap 20 detik berhenti</w:t>
+            </w:r>
+          </w:p>
+        </w:tc>
+      </w:tr>
+      <w:tr>
+        <w:tc>
+          <w:tcPr>
+            <w:tcW w:type="dxa" w:w="4320"/>
+          </w:tcPr>
+          <w:p>
+            <w:r>
+              <w:t>Pindaian deposit berhenti untuk order berumur lebih 48 jam</w:t>
+            </w:r>
+          </w:p>
+        </w:tc>
+        <w:tc>
+          <w:tcPr>
+            <w:tcW w:type="dxa" w:w="4320"/>
+          </w:tcPr>
+          <w:p>
+            <w:r>
+              <w:t>Order mati tidak lagi membuang kuota RPC dan log</w:t>
+            </w:r>
+          </w:p>
+        </w:tc>
+      </w:tr>
+      <w:tr>
+        <w:tc>
+          <w:tcPr>
+            <w:tcW w:type="dxa" w:w="4320"/>
+          </w:tcPr>
+          <w:p>
+            <w:r>
+              <w:t>Order deposit macet lebih 48 jam otomatis menjadi expired</w:t>
+            </w:r>
+          </w:p>
+        </w:tc>
+        <w:tc>
+          <w:tcPr>
+            <w:tcW w:type="dxa" w:w="4320"/>
+          </w:tcPr>
+          <w:p>
+            <w:r>
+              <w:t>Status order di panel admin akurat; tidak ada order menggantung</w:t>
+            </w:r>
+          </w:p>
+        </w:tc>
+      </w:tr>
+    </w:tbl>
+    <w:p/>
+    <w:p>
+      <w:r>
+        <w:t>Error berulang yang dilaporkan admin ternyata dua hal terpisah: pembatasan rate API harga (ditangani fallback Binance+kurs, commit 8346747) dan jendela pindaian blockchain terlalu lebar (commit 9447fa6).</w:t>
+      </w:r>
+    </w:p>
+    <w:p>
       <w:r>
         <w:rPr>
           <w:color w:val="666666"/>

</xml_diff>

<commit_message>
docs: laporan audit final 25 Sep - 2 transaksi convert e2e COMPLETED
</commit_message>
<xml_diff>
--- a/docs/laporan-uji-nyata-2026-09-21.docx
+++ b/docs/laporan-uji-nyata-2026-09-21.docx
@@ -2892,6 +2892,163 @@
         <w:t>Dokumen ini dibuat otomatis dari hasil pengujian langsung di blockchain mainnet.</w:t>
       </w:r>
     </w:p>
+    <w:p>
+      <w:pPr>
+        <w:pStyle w:val="Heading1"/>
+      </w:pPr>
+      <w:r>
+        <w:t>9. Hasil Audit Final 25 Sep 2026</w:t>
+      </w:r>
+    </w:p>
+    <w:p>
+      <w:r>
+        <w:t>Dua transaksi convert nyata 0.5 USDT BSC ke USDC BSC lewat pipeline otomatis:</w:t>
+      </w:r>
+    </w:p>
+    <w:tbl>
+      <w:tblPr>
+        <w:tblStyle w:val="LightGrid-Accent1"/>
+        <w:tblW w:type="auto" w:w="0"/>
+        <w:tblLook w:firstColumn="1" w:firstRow="1" w:lastColumn="0" w:lastRow="0" w:noHBand="0" w:noVBand="1" w:val="04A0"/>
+      </w:tblPr>
+      <w:tblGrid>
+        <w:gridCol w:w="2160"/>
+        <w:gridCol w:w="2160"/>
+        <w:gridCol w:w="2160"/>
+        <w:gridCol w:w="2160"/>
+      </w:tblGrid>
+      <w:tr>
+        <w:tc>
+          <w:tcPr>
+            <w:tcW w:type="dxa" w:w="2160"/>
+          </w:tcPr>
+          <w:p>
+            <w:r>
+              <w:t>Uji</w:t>
+            </w:r>
+          </w:p>
+        </w:tc>
+        <w:tc>
+          <w:tcPr>
+            <w:tcW w:type="dxa" w:w="2160"/>
+          </w:tcPr>
+          <w:p>
+            <w:r>
+              <w:t>Deposit</w:t>
+            </w:r>
+          </w:p>
+        </w:tc>
+        <w:tc>
+          <w:tcPr>
+            <w:tcW w:type="dxa" w:w="2160"/>
+          </w:tcPr>
+          <w:p>
+            <w:r>
+              <w:t>Payout Otomatis</w:t>
+            </w:r>
+          </w:p>
+        </w:tc>
+        <w:tc>
+          <w:tcPr>
+            <w:tcW w:type="dxa" w:w="2160"/>
+          </w:tcPr>
+          <w:p>
+            <w:r>
+              <w:t>Status</w:t>
+            </w:r>
+          </w:p>
+        </w:tc>
+      </w:tr>
+      <w:tr>
+        <w:tc>
+          <w:tcPr>
+            <w:tcW w:type="dxa" w:w="2160"/>
+          </w:tcPr>
+          <w:p>
+            <w:r>
+              <w:t>Convert 1 - jalur hash user</w:t>
+            </w:r>
+          </w:p>
+        </w:tc>
+        <w:tc>
+          <w:tcPr>
+            <w:tcW w:type="dxa" w:w="2160"/>
+          </w:tcPr>
+          <w:p>
+            <w:r>
+              <w:t>e2e518ca...</w:t>
+            </w:r>
+          </w:p>
+        </w:tc>
+        <w:tc>
+          <w:tcPr>
+            <w:tcW w:type="dxa" w:w="2160"/>
+          </w:tcPr>
+          <w:p>
+            <w:r>
+              <w:t>0x63b51817... 0.305 USDC</w:t>
+            </w:r>
+          </w:p>
+        </w:tc>
+        <w:tc>
+          <w:tcPr>
+            <w:tcW w:type="dxa" w:w="2160"/>
+          </w:tcPr>
+          <w:p>
+            <w:r>
+              <w:t>COMPLETED</w:t>
+            </w:r>
+          </w:p>
+        </w:tc>
+      </w:tr>
+      <w:tr>
+        <w:tc>
+          <w:tcPr>
+            <w:tcW w:type="dxa" w:w="2160"/>
+          </w:tcPr>
+          <w:p>
+            <w:r>
+              <w:t>Convert 2 - scanner otomatis</w:t>
+            </w:r>
+          </w:p>
+        </w:tc>
+        <w:tc>
+          <w:tcPr>
+            <w:tcW w:type="dxa" w:w="2160"/>
+          </w:tcPr>
+          <w:p>
+            <w:r>
+              <w:t>b75906fc...</w:t>
+            </w:r>
+          </w:p>
+        </w:tc>
+        <w:tc>
+          <w:tcPr>
+            <w:tcW w:type="dxa" w:w="2160"/>
+          </w:tcPr>
+          <w:p>
+            <w:r>
+              <w:t>0x4e32f6bc... 0.30488 USDC</w:t>
+            </w:r>
+          </w:p>
+        </w:tc>
+        <w:tc>
+          <w:tcPr>
+            <w:tcW w:type="dxa" w:w="2160"/>
+          </w:tcPr>
+          <w:p>
+            <w:r>
+              <w:t>COMPLETED</w:t>
+            </w:r>
+          </w:p>
+        </w:tc>
+      </w:tr>
+    </w:tbl>
+    <w:p>
+      <w:r>
+        <w:t>Harga: 16 koin via CoinGecko, fallback CoinPaprika dan CoinMarketCap 17 koin konsisten selisih di bawah 0.1 persen. RPC BSC via Alchemy aktif. Hanya satu peringatan transien RPC KAIA yang dirotasi otomatis.</w:t>
+      </w:r>
+    </w:p>
     <w:sectPr>
       <w:pgSz w:w="12240" w:h="15840"/>
       <w:pgMar w:top="1440" w:right="1800" w:bottom="1440" w:left="1800" w:header="720" w:footer="720" w:gutter="0"/>

</xml_diff>